<commit_message>
made the model and tested and cross checked it
</commit_message>
<xml_diff>
--- a/Abbreviation_of_features.docx
+++ b/Abbreviation_of_features.docx
@@ -2,9 +2,127 @@
 <file path=word/document.xml><?xml version="1.0" encoding="utf-8"?>
 <w:document xmlns:wpc="http://schemas.microsoft.com/office/word/2010/wordprocessingCanvas" xmlns:cx="http://schemas.microsoft.com/office/drawing/2014/chartex" xmlns:cx1="http://schemas.microsoft.com/office/drawing/2015/9/8/chartex" xmlns:cx2="http://schemas.microsoft.com/office/drawing/2015/10/21/chartex" xmlns:cx3="http://schemas.microsoft.com/office/drawing/2016/5/9/chartex" xmlns:cx4="http://schemas.microsoft.com/office/drawing/2016/5/10/chartex" xmlns:cx5="http://schemas.microsoft.com/office/drawing/2016/5/11/chartex" xmlns:cx6="http://schemas.microsoft.com/office/drawing/2016/5/12/chartex" xmlns:cx7="http://schemas.microsoft.com/office/drawing/2016/5/13/chartex" xmlns:cx8="http://schemas.microsoft.com/office/drawing/2016/5/14/chartex" xmlns:mc="http://schemas.openxmlformats.org/markup-compatibility/2006" xmlns:aink="http://schemas.microsoft.com/office/drawing/2016/ink" xmlns:am3d="http://schemas.microsoft.com/office/drawing/2017/model3d" xmlns:o="urn:schemas-microsoft-com:office:office" xmlns:oel="http://schemas.microsoft.com/office/2019/extlst" xmlns:r="http://schemas.openxmlformats.org/officeDocument/2006/relationships" xmlns:m="http://schemas.openxmlformats.org/officeDocument/2006/math" xmlns:v="urn:schemas-microsoft-com:vml" xmlns:wp14="http://schemas.microsoft.com/office/word/2010/wordprocessingDrawing" xmlns:wp="http://schemas.openxmlformats.org/drawingml/2006/wordprocessingDrawing" xmlns:w10="urn:schemas-microsoft-com:office:word" xmlns:w="http://schemas.openxmlformats.org/wordprocessingml/2006/main" xmlns:w14="http://schemas.microsoft.com/office/word/2010/wordml" xmlns:w15="http://schemas.microsoft.com/office/word/2012/wordml" xmlns:w16cex="http://schemas.microsoft.com/office/word/2018/wordml/cex" xmlns:w16cid="http://schemas.microsoft.com/office/word/2016/wordml/cid" xmlns:w16="http://schemas.microsoft.com/office/word/2018/wordml" xmlns:w16du="http://schemas.microsoft.com/office/word/2023/wordml/word16du" xmlns:w16sdtdh="http://schemas.microsoft.com/office/word/2020/wordml/sdtdatahash" xmlns:w16sdtfl="http://schemas.microsoft.com/office/word/2024/wordml/sdtformatlock" xmlns:w16se="http://schemas.microsoft.com/office/word/2015/wordml/symex" xmlns:wpg="http://schemas.microsoft.com/office/word/2010/wordprocessingGroup" xmlns:wpi="http://schemas.microsoft.com/office/word/2010/wordprocessingInk" xmlns:wne="http://schemas.microsoft.com/office/word/2006/wordml" xmlns:wps="http://schemas.microsoft.com/office/word/2010/wordprocessingShape" mc:Ignorable="w14 w15 w16se w16cid w16 w16cex w16sdtdh w16sdtfl w16du wp14">
   <w:body>
+    <w:p>
+      <w:pPr>
+        <w:rPr>
+          <w:b/>
+          <w:bCs/>
+        </w:rPr>
+      </w:pPr>
+      <w:r>
+        <w:rPr>
+          <w:b/>
+          <w:bCs/>
+        </w:rPr>
+        <w:t>Progress Report</w:t>
+      </w:r>
+    </w:p>
+    <w:p>
+      <w:r>
+        <w:rPr>
+          <w:b/>
+          <w:bCs/>
+        </w:rPr>
+        <w:t>Student:</w:t>
+      </w:r>
+      <w:r>
+        <w:t xml:space="preserve"> Avirup Mukherjee</w:t>
+      </w:r>
+    </w:p>
+    <w:p>
+      <w:r>
+        <w:rPr>
+          <w:b/>
+          <w:bCs/>
+        </w:rPr>
+        <w:t>Date:</w:t>
+      </w:r>
+      <w:r>
+        <w:t xml:space="preserve"> March 31, 2026</w:t>
+      </w:r>
+    </w:p>
+    <w:p>
+      <w:r>
+        <w:rPr>
+          <w:b/>
+          <w:bCs/>
+        </w:rPr>
+        <w:t>Subject:</w:t>
+      </w:r>
+      <w:r>
+        <w:t xml:space="preserve"> Project Progress – Data Pre-processing and Initial Model Development</w:t>
+      </w:r>
+    </w:p>
+    <w:p>
+      <w:r>
+        <w:pict w14:anchorId="1DD62D9A">
+          <v:rect id="_x0000_i1044" style="width:0;height:1.5pt" o:hralign="center" o:hrstd="t" o:hrnoshade="t" o:hr="t" fillcolor="gray" stroked="f"/>
+        </w:pict>
+      </w:r>
+    </w:p>
+    <w:p>
+      <w:pPr>
+        <w:rPr>
+          <w:b/>
+          <w:bCs/>
+        </w:rPr>
+      </w:pPr>
+      <w:r>
+        <w:rPr>
+          <w:b/>
+          <w:bCs/>
+        </w:rPr>
+        <w:t>1. Dataset Acquisition and Rationale</w:t>
+      </w:r>
+    </w:p>
+    <w:p>
+      <w:r>
+        <w:rPr>
+          <w:b/>
+          <w:bCs/>
+        </w:rPr>
+        <w:t>Dataset Link:</w:t>
+      </w:r>
+      <w:r>
+        <w:t xml:space="preserve"> </w:t>
+      </w:r>
+      <w:hyperlink r:id="rId5" w:history="1">
+        <w:r>
+          <w:rPr>
+            <w:rStyle w:val="Hyperlink"/>
+          </w:rPr>
+          <w:t>https://www.kaggle.com/datasets/mansoordaku/ckdisease</w:t>
+        </w:r>
+      </w:hyperlink>
+    </w:p>
+    <w:p>
+      <w:r>
+        <w:t>For the initial phase of this project, I opted to use a publicly available online dataset. Utilizing an established dataset provides a standardized, well-annotated foundation to build and test the architecture of the model. This approach allows for accurate benchmarking of the model's performance and ensures the computational pipeline is structurally sound before transitioning to our own experimental or wet-lab data.</w:t>
+      </w:r>
+    </w:p>
+    <w:p>
+      <w:pPr>
+        <w:rPr>
+          <w:b/>
+          <w:bCs/>
+        </w:rPr>
+      </w:pPr>
+      <w:r>
+        <w:rPr>
+          <w:b/>
+          <w:bCs/>
+        </w:rPr>
+        <w:t>2. Dataset Description and Data Dictionary</w:t>
+      </w:r>
+    </w:p>
+    <w:p>
+      <w:r>
+        <w:t>The CSV file contains multi-dimensional data essential for training the model to recognize target patterns. To ensure clarity regarding the features fed into the algorithm, the table below outlines the specific abbreviations used in the dataset, their practical applications within the scope of this project, and their corresponding data types.</w:t>
+      </w:r>
+    </w:p>
     <w:tbl>
       <w:tblPr>
-        <w:tblW w:w="0" w:type="dxa"/>
+        <w:tblW w:w="9010" w:type="dxa"/>
         <w:tblCellMar>
           <w:left w:w="0" w:type="dxa"/>
           <w:right w:w="0" w:type="dxa"/>
@@ -190,7 +308,15 @@
           </w:tcPr>
           <w:p>
             <w:r>
-              <w:t>Has no biological value. We will delete this later so the model doesn't learn useless patterns.</w:t>
+              <w:t xml:space="preserve">Has no biological value. We will delete this later so the model </w:t>
+            </w:r>
+            <w:proofErr w:type="gramStart"/>
+            <w:r>
+              <w:t>doesn't</w:t>
+            </w:r>
+            <w:proofErr w:type="gramEnd"/>
+            <w:r>
+              <w:t xml:space="preserve"> learn useless patterns.</w:t>
             </w:r>
           </w:p>
         </w:tc>
@@ -392,7 +518,15 @@
           </w:tcPr>
           <w:p>
             <w:r>
-              <w:t>High BP pushes too hard against the kidney filters, tearing them. It's a primary cause of CKD.</w:t>
+              <w:t xml:space="preserve">High BP pushes too hard against the kidney filters, tearing them. </w:t>
+            </w:r>
+            <w:proofErr w:type="gramStart"/>
+            <w:r>
+              <w:t>It's</w:t>
+            </w:r>
+            <w:proofErr w:type="gramEnd"/>
+            <w:r>
+              <w:t xml:space="preserve"> a primary cause of CKD.</w:t>
             </w:r>
           </w:p>
         </w:tc>
@@ -646,9 +780,11 @@
             <w:hideMark/>
           </w:tcPr>
           <w:p>
+            <w:proofErr w:type="spellStart"/>
             <w:r>
               <w:t>su</w:t>
             </w:r>
+            <w:proofErr w:type="spellEnd"/>
           </w:p>
         </w:tc>
         <w:tc>
@@ -747,9 +883,11 @@
             <w:hideMark/>
           </w:tcPr>
           <w:p>
+            <w:proofErr w:type="spellStart"/>
             <w:r>
               <w:t>rbc</w:t>
             </w:r>
+            <w:proofErr w:type="spellEnd"/>
           </w:p>
         </w:tc>
         <w:tc>
@@ -949,9 +1087,12 @@
             <w:hideMark/>
           </w:tcPr>
           <w:p>
-            <w:r>
+            <w:proofErr w:type="spellStart"/>
+            <w:r>
+              <w:lastRenderedPageBreak/>
               <w:t>pcc</w:t>
             </w:r>
+            <w:proofErr w:type="spellEnd"/>
           </w:p>
         </w:tc>
         <w:tc>
@@ -998,7 +1139,15 @@
           </w:tcPr>
           <w:p>
             <w:r>
-              <w:t>Phase 1 Target! Clumps or "casts" are physical molds of damaged kidney tubes.</w:t>
+              <w:t xml:space="preserve">Phase 1 Target! Clumps or "casts" are physical </w:t>
+            </w:r>
+            <w:proofErr w:type="spellStart"/>
+            <w:r>
+              <w:t>molds</w:t>
+            </w:r>
+            <w:proofErr w:type="spellEnd"/>
+            <w:r>
+              <w:t xml:space="preserve"> of damaged kidney tubes.</w:t>
             </w:r>
           </w:p>
         </w:tc>
@@ -1050,9 +1199,11 @@
             <w:hideMark/>
           </w:tcPr>
           <w:p>
+            <w:proofErr w:type="spellStart"/>
             <w:r>
               <w:t>ba</w:t>
             </w:r>
+            <w:proofErr w:type="spellEnd"/>
           </w:p>
         </w:tc>
         <w:tc>
@@ -1151,9 +1302,11 @@
             <w:hideMark/>
           </w:tcPr>
           <w:p>
+            <w:proofErr w:type="spellStart"/>
             <w:r>
               <w:t>bgr</w:t>
             </w:r>
+            <w:proofErr w:type="spellEnd"/>
           </w:p>
         </w:tc>
         <w:tc>
@@ -1252,9 +1405,11 @@
             <w:hideMark/>
           </w:tcPr>
           <w:p>
+            <w:proofErr w:type="spellStart"/>
             <w:r>
               <w:t>bu</w:t>
             </w:r>
+            <w:proofErr w:type="spellEnd"/>
           </w:p>
         </w:tc>
         <w:tc>
@@ -1301,7 +1456,15 @@
           </w:tcPr>
           <w:p>
             <w:r>
-              <w:t>Toxic nitrogen waste building up in the bloodstream because it isn't being filtered.</w:t>
+              <w:t xml:space="preserve">Toxic nitrogen waste building up in the bloodstream because it </w:t>
+            </w:r>
+            <w:proofErr w:type="gramStart"/>
+            <w:r>
+              <w:t>isn't</w:t>
+            </w:r>
+            <w:proofErr w:type="gramEnd"/>
+            <w:r>
+              <w:t xml:space="preserve"> being filtered.</w:t>
             </w:r>
           </w:p>
         </w:tc>
@@ -1353,9 +1516,11 @@
             <w:hideMark/>
           </w:tcPr>
           <w:p>
+            <w:proofErr w:type="spellStart"/>
             <w:r>
               <w:t>sc</w:t>
             </w:r>
+            <w:proofErr w:type="spellEnd"/>
           </w:p>
         </w:tc>
         <w:tc>
@@ -1503,7 +1668,15 @@
           </w:tcPr>
           <w:p>
             <w:r>
-              <w:t>Electrolyte. Failing kidneys can't remove salt, causing severe swelling and higher blood pressure.</w:t>
+              <w:t xml:space="preserve">Electrolyte. Failing kidneys </w:t>
+            </w:r>
+            <w:proofErr w:type="gramStart"/>
+            <w:r>
+              <w:t>can't</w:t>
+            </w:r>
+            <w:proofErr w:type="gramEnd"/>
+            <w:r>
+              <w:t xml:space="preserve"> remove salt, causing severe swelling and higher blood pressure.</w:t>
             </w:r>
           </w:p>
         </w:tc>
@@ -1656,56 +1829,68 @@
             <w:hideMark/>
           </w:tcPr>
           <w:p>
+            <w:proofErr w:type="spellStart"/>
             <w:r>
               <w:t>hemo</w:t>
             </w:r>
-          </w:p>
-        </w:tc>
-        <w:tc>
-          <w:tcPr>
-            <w:tcW w:w="0" w:type="auto"/>
-            <w:tcBorders>
-              <w:top w:val="single" w:sz="6" w:space="0" w:color="CCCCCC"/>
-              <w:left w:val="single" w:sz="6" w:space="0" w:color="CCCCCC"/>
-              <w:bottom w:val="single" w:sz="6" w:space="0" w:color="CCCCCC"/>
-              <w:right w:val="single" w:sz="6" w:space="0" w:color="CCCCCC"/>
-            </w:tcBorders>
-            <w:tcMar>
-              <w:top w:w="30" w:type="dxa"/>
-              <w:left w:w="45" w:type="dxa"/>
-              <w:bottom w:w="30" w:type="dxa"/>
-              <w:right w:w="45" w:type="dxa"/>
-            </w:tcMar>
-            <w:vAlign w:val="bottom"/>
-            <w:hideMark/>
-          </w:tcPr>
-          <w:p>
+            <w:proofErr w:type="spellEnd"/>
+          </w:p>
+        </w:tc>
+        <w:tc>
+          <w:tcPr>
+            <w:tcW w:w="0" w:type="auto"/>
+            <w:tcBorders>
+              <w:top w:val="single" w:sz="6" w:space="0" w:color="CCCCCC"/>
+              <w:left w:val="single" w:sz="6" w:space="0" w:color="CCCCCC"/>
+              <w:bottom w:val="single" w:sz="6" w:space="0" w:color="CCCCCC"/>
+              <w:right w:val="single" w:sz="6" w:space="0" w:color="CCCCCC"/>
+            </w:tcBorders>
+            <w:tcMar>
+              <w:top w:w="30" w:type="dxa"/>
+              <w:left w:w="45" w:type="dxa"/>
+              <w:bottom w:w="30" w:type="dxa"/>
+              <w:right w:w="45" w:type="dxa"/>
+            </w:tcMar>
+            <w:vAlign w:val="bottom"/>
+            <w:hideMark/>
+          </w:tcPr>
+          <w:p>
+            <w:proofErr w:type="spellStart"/>
             <w:r>
               <w:t>Hemoglobin</w:t>
             </w:r>
-          </w:p>
-        </w:tc>
-        <w:tc>
-          <w:tcPr>
-            <w:tcW w:w="0" w:type="auto"/>
-            <w:tcBorders>
-              <w:top w:val="single" w:sz="6" w:space="0" w:color="CCCCCC"/>
-              <w:left w:val="single" w:sz="6" w:space="0" w:color="CCCCCC"/>
-              <w:bottom w:val="single" w:sz="6" w:space="0" w:color="CCCCCC"/>
-              <w:right w:val="single" w:sz="6" w:space="0" w:color="CCCCCC"/>
-            </w:tcBorders>
-            <w:tcMar>
-              <w:top w:w="30" w:type="dxa"/>
-              <w:left w:w="45" w:type="dxa"/>
-              <w:bottom w:w="30" w:type="dxa"/>
-              <w:right w:w="45" w:type="dxa"/>
-            </w:tcMar>
-            <w:vAlign w:val="bottom"/>
-            <w:hideMark/>
-          </w:tcPr>
-          <w:p>
-            <w:r>
-              <w:t>Kidneys make a hormone (EPO) that creates red blood cells. Broken kidneys = low hemoglobin.</w:t>
+            <w:proofErr w:type="spellEnd"/>
+          </w:p>
+        </w:tc>
+        <w:tc>
+          <w:tcPr>
+            <w:tcW w:w="0" w:type="auto"/>
+            <w:tcBorders>
+              <w:top w:val="single" w:sz="6" w:space="0" w:color="CCCCCC"/>
+              <w:left w:val="single" w:sz="6" w:space="0" w:color="CCCCCC"/>
+              <w:bottom w:val="single" w:sz="6" w:space="0" w:color="CCCCCC"/>
+              <w:right w:val="single" w:sz="6" w:space="0" w:color="CCCCCC"/>
+            </w:tcBorders>
+            <w:tcMar>
+              <w:top w:w="30" w:type="dxa"/>
+              <w:left w:w="45" w:type="dxa"/>
+              <w:bottom w:w="30" w:type="dxa"/>
+              <w:right w:w="45" w:type="dxa"/>
+            </w:tcMar>
+            <w:vAlign w:val="bottom"/>
+            <w:hideMark/>
+          </w:tcPr>
+          <w:p>
+            <w:r>
+              <w:t xml:space="preserve">Kidneys make a hormone (EPO) that creates red blood cells. Broken kidneys = low </w:t>
+            </w:r>
+            <w:proofErr w:type="spellStart"/>
+            <w:r>
+              <w:t>hemoglobin</w:t>
+            </w:r>
+            <w:proofErr w:type="spellEnd"/>
+            <w:r>
+              <w:t>.</w:t>
             </w:r>
           </w:p>
         </w:tc>
@@ -1757,10 +1942,11 @@
             <w:hideMark/>
           </w:tcPr>
           <w:p>
-            <w:r>
-              <w:lastRenderedPageBreak/>
+            <w:proofErr w:type="spellStart"/>
+            <w:r>
               <w:t>pcv</w:t>
             </w:r>
+            <w:proofErr w:type="spellEnd"/>
           </w:p>
         </w:tc>
         <w:tc>
@@ -1807,7 +1993,23 @@
           </w:tcPr>
           <w:p>
             <w:r>
-              <w:t>The percentage of blood that is cells vs. liquid. Used alongside hemoglobin to detect anemia.</w:t>
+              <w:t xml:space="preserve">The percentage of blood that is cells vs. liquid. Used alongside </w:t>
+            </w:r>
+            <w:proofErr w:type="spellStart"/>
+            <w:r>
+              <w:t>hemoglobin</w:t>
+            </w:r>
+            <w:proofErr w:type="spellEnd"/>
+            <w:r>
+              <w:t xml:space="preserve"> to detect </w:t>
+            </w:r>
+            <w:proofErr w:type="spellStart"/>
+            <w:r>
+              <w:t>anemia</w:t>
+            </w:r>
+            <w:proofErr w:type="spellEnd"/>
+            <w:r>
+              <w:t>.</w:t>
             </w:r>
           </w:p>
         </w:tc>
@@ -1859,9 +2061,11 @@
             <w:hideMark/>
           </w:tcPr>
           <w:p>
+            <w:proofErr w:type="spellStart"/>
             <w:r>
               <w:t>wc</w:t>
             </w:r>
+            <w:proofErr w:type="spellEnd"/>
           </w:p>
         </w:tc>
         <w:tc>
@@ -1960,9 +2164,11 @@
             <w:hideMark/>
           </w:tcPr>
           <w:p>
+            <w:proofErr w:type="spellStart"/>
             <w:r>
               <w:t>rc</w:t>
             </w:r>
+            <w:proofErr w:type="spellEnd"/>
           </w:p>
         </w:tc>
         <w:tc>
@@ -2061,9 +2267,11 @@
             <w:hideMark/>
           </w:tcPr>
           <w:p>
+            <w:proofErr w:type="spellStart"/>
             <w:r>
               <w:t>htn</w:t>
             </w:r>
+            <w:proofErr w:type="spellEnd"/>
           </w:p>
         </w:tc>
         <w:tc>
@@ -2364,9 +2572,11 @@
             <w:hideMark/>
           </w:tcPr>
           <w:p>
+            <w:proofErr w:type="spellStart"/>
             <w:r>
               <w:t>appet</w:t>
             </w:r>
+            <w:proofErr w:type="spellEnd"/>
           </w:p>
         </w:tc>
         <w:tc>
@@ -2413,7 +2623,23 @@
           </w:tcPr>
           <w:p>
             <w:r>
-              <w:t>As toxic waste (bu and sc) builds up in the blood, patients feel too nauseous to eat.</w:t>
+              <w:t>As toxic waste (</w:t>
+            </w:r>
+            <w:proofErr w:type="spellStart"/>
+            <w:r>
+              <w:t>bu</w:t>
+            </w:r>
+            <w:proofErr w:type="spellEnd"/>
+            <w:r>
+              <w:t xml:space="preserve"> and </w:t>
+            </w:r>
+            <w:proofErr w:type="spellStart"/>
+            <w:r>
+              <w:t>sc</w:t>
+            </w:r>
+            <w:proofErr w:type="spellEnd"/>
+            <w:r>
+              <w:t>) builds up in the blood, patients feel too nauseous to eat.</w:t>
             </w:r>
           </w:p>
         </w:tc>
@@ -2490,31 +2716,44 @@
           </w:tcPr>
           <w:p>
             <w:r>
-              <w:t>Pedal Edema</w:t>
-            </w:r>
-          </w:p>
-        </w:tc>
-        <w:tc>
-          <w:tcPr>
-            <w:tcW w:w="0" w:type="auto"/>
-            <w:tcBorders>
-              <w:top w:val="single" w:sz="6" w:space="0" w:color="CCCCCC"/>
-              <w:left w:val="single" w:sz="6" w:space="0" w:color="CCCCCC"/>
-              <w:bottom w:val="single" w:sz="6" w:space="0" w:color="CCCCCC"/>
-              <w:right w:val="single" w:sz="6" w:space="0" w:color="CCCCCC"/>
-            </w:tcBorders>
-            <w:tcMar>
-              <w:top w:w="30" w:type="dxa"/>
-              <w:left w:w="45" w:type="dxa"/>
-              <w:bottom w:w="30" w:type="dxa"/>
-              <w:right w:w="45" w:type="dxa"/>
-            </w:tcMar>
-            <w:vAlign w:val="bottom"/>
-            <w:hideMark/>
-          </w:tcPr>
-          <w:p>
-            <w:r>
-              <w:t>Swelling in the feet/ankles because the kidneys aren't removing excess water from the body.</w:t>
+              <w:t xml:space="preserve">Pedal </w:t>
+            </w:r>
+            <w:proofErr w:type="spellStart"/>
+            <w:r>
+              <w:t>Edema</w:t>
+            </w:r>
+            <w:proofErr w:type="spellEnd"/>
+          </w:p>
+        </w:tc>
+        <w:tc>
+          <w:tcPr>
+            <w:tcW w:w="0" w:type="auto"/>
+            <w:tcBorders>
+              <w:top w:val="single" w:sz="6" w:space="0" w:color="CCCCCC"/>
+              <w:left w:val="single" w:sz="6" w:space="0" w:color="CCCCCC"/>
+              <w:bottom w:val="single" w:sz="6" w:space="0" w:color="CCCCCC"/>
+              <w:right w:val="single" w:sz="6" w:space="0" w:color="CCCCCC"/>
+            </w:tcBorders>
+            <w:tcMar>
+              <w:top w:w="30" w:type="dxa"/>
+              <w:left w:w="45" w:type="dxa"/>
+              <w:bottom w:w="30" w:type="dxa"/>
+              <w:right w:w="45" w:type="dxa"/>
+            </w:tcMar>
+            <w:vAlign w:val="bottom"/>
+            <w:hideMark/>
+          </w:tcPr>
+          <w:p>
+            <w:r>
+              <w:t xml:space="preserve">Swelling in the feet/ankles because the kidneys </w:t>
+            </w:r>
+            <w:proofErr w:type="gramStart"/>
+            <w:r>
+              <w:t>aren't</w:t>
+            </w:r>
+            <w:proofErr w:type="gramEnd"/>
+            <w:r>
+              <w:t xml:space="preserve"> removing excess water from the body.</w:t>
             </w:r>
           </w:p>
         </w:tc>
@@ -2566,33 +2805,38 @@
             <w:hideMark/>
           </w:tcPr>
           <w:p>
-            <w:r>
+            <w:proofErr w:type="spellStart"/>
+            <w:r>
+              <w:lastRenderedPageBreak/>
               <w:t>ane</w:t>
             </w:r>
-          </w:p>
-        </w:tc>
-        <w:tc>
-          <w:tcPr>
-            <w:tcW w:w="0" w:type="auto"/>
-            <w:tcBorders>
-              <w:top w:val="single" w:sz="6" w:space="0" w:color="CCCCCC"/>
-              <w:left w:val="single" w:sz="6" w:space="0" w:color="CCCCCC"/>
-              <w:bottom w:val="single" w:sz="6" w:space="0" w:color="CCCCCC"/>
-              <w:right w:val="single" w:sz="6" w:space="0" w:color="CCCCCC"/>
-            </w:tcBorders>
-            <w:tcMar>
-              <w:top w:w="30" w:type="dxa"/>
-              <w:left w:w="45" w:type="dxa"/>
-              <w:bottom w:w="30" w:type="dxa"/>
-              <w:right w:w="45" w:type="dxa"/>
-            </w:tcMar>
-            <w:vAlign w:val="bottom"/>
-            <w:hideMark/>
-          </w:tcPr>
-          <w:p>
+            <w:proofErr w:type="spellEnd"/>
+          </w:p>
+        </w:tc>
+        <w:tc>
+          <w:tcPr>
+            <w:tcW w:w="0" w:type="auto"/>
+            <w:tcBorders>
+              <w:top w:val="single" w:sz="6" w:space="0" w:color="CCCCCC"/>
+              <w:left w:val="single" w:sz="6" w:space="0" w:color="CCCCCC"/>
+              <w:bottom w:val="single" w:sz="6" w:space="0" w:color="CCCCCC"/>
+              <w:right w:val="single" w:sz="6" w:space="0" w:color="CCCCCC"/>
+            </w:tcBorders>
+            <w:tcMar>
+              <w:top w:w="30" w:type="dxa"/>
+              <w:left w:w="45" w:type="dxa"/>
+              <w:bottom w:w="30" w:type="dxa"/>
+              <w:right w:w="45" w:type="dxa"/>
+            </w:tcMar>
+            <w:vAlign w:val="bottom"/>
+            <w:hideMark/>
+          </w:tcPr>
+          <w:p>
+            <w:proofErr w:type="spellStart"/>
             <w:r>
               <w:t>Anemia</w:t>
             </w:r>
+            <w:proofErr w:type="spellEnd"/>
           </w:p>
         </w:tc>
         <w:tc>
@@ -2716,7 +2960,23 @@
           </w:tcPr>
           <w:p>
             <w:r>
-              <w:t>The Answer Key. ckd (Sick) or notckd (Healthy). The model learns to predict this.</w:t>
+              <w:t xml:space="preserve">The Answer Key. </w:t>
+            </w:r>
+            <w:proofErr w:type="spellStart"/>
+            <w:r>
+              <w:t>ckd</w:t>
+            </w:r>
+            <w:proofErr w:type="spellEnd"/>
+            <w:r>
+              <w:t xml:space="preserve"> (Sick) or </w:t>
+            </w:r>
+            <w:proofErr w:type="spellStart"/>
+            <w:r>
+              <w:t>notckd</w:t>
+            </w:r>
+            <w:proofErr w:type="spellEnd"/>
+            <w:r>
+              <w:t xml:space="preserve"> (Healthy). The model learns to predict this.</w:t>
             </w:r>
           </w:p>
         </w:tc>
@@ -2746,7 +3006,381 @@
         </w:tc>
       </w:tr>
     </w:tbl>
-    <w:p/>
+    <w:p>
+      <w:pPr>
+        <w:rPr>
+          <w:b/>
+          <w:bCs/>
+        </w:rPr>
+      </w:pPr>
+    </w:p>
+    <w:p>
+      <w:pPr>
+        <w:rPr>
+          <w:b/>
+          <w:bCs/>
+        </w:rPr>
+      </w:pPr>
+      <w:r>
+        <w:rPr>
+          <w:b/>
+          <w:bCs/>
+        </w:rPr>
+        <w:t>3. Data Pre-Processing Sequence</w:t>
+      </w:r>
+    </w:p>
+    <w:p>
+      <w:r>
+        <w:t>To ensure the model receives clean, high-quality data, I performed the following sequential pre-processing steps on the raw CSV file:</w:t>
+      </w:r>
+    </w:p>
+    <w:p>
+      <w:pPr>
+        <w:numPr>
+          <w:ilvl w:val="0"/>
+          <w:numId w:val="1"/>
+        </w:numPr>
+      </w:pPr>
+      <w:r>
+        <w:rPr>
+          <w:b/>
+          <w:bCs/>
+        </w:rPr>
+        <w:t>Data Loading and Inspection:</w:t>
+      </w:r>
+      <w:r>
+        <w:t xml:space="preserve"> Imported the dataset and conducted an initial exploratory analysis to identify missing values, outliers, and data distribution.</w:t>
+      </w:r>
+    </w:p>
+    <w:p>
+      <w:pPr>
+        <w:numPr>
+          <w:ilvl w:val="0"/>
+          <w:numId w:val="1"/>
+        </w:numPr>
+      </w:pPr>
+      <w:r>
+        <w:rPr>
+          <w:b/>
+          <w:bCs/>
+        </w:rPr>
+        <w:t xml:space="preserve">Handling Missing Values: </w:t>
+      </w:r>
+      <w:r>
+        <w:t>Missing values were handled systematically based on their data types to avoid dropping valuable patient records. For continuous numerical features, null values were imputed using the median of their respective columns to preserve the statistical distribution while preventing skewing from potential outliers. For categorical features, missing data was filled using mode imputation (the most frequent class), safely assuming the most probable category based on the existing dataset.</w:t>
+      </w:r>
+    </w:p>
+    <w:p>
+      <w:pPr>
+        <w:numPr>
+          <w:ilvl w:val="0"/>
+          <w:numId w:val="1"/>
+        </w:numPr>
+      </w:pPr>
+      <w:r>
+        <w:rPr>
+          <w:b/>
+          <w:bCs/>
+        </w:rPr>
+        <w:t>Feature Dropping and Dimensionality Reduction:</w:t>
+      </w:r>
+      <w:r>
+        <w:t xml:space="preserve"> Several features were deliberately dropped from the dataset.</w:t>
+      </w:r>
+    </w:p>
+    <w:p>
+      <w:pPr>
+        <w:numPr>
+          <w:ilvl w:val="1"/>
+          <w:numId w:val="1"/>
+        </w:numPr>
+      </w:pPr>
+      <w:r>
+        <w:rPr>
+          <w:i/>
+          <w:iCs/>
+        </w:rPr>
+        <w:t>Rationale:</w:t>
+      </w:r>
+      <w:r>
+        <w:t xml:space="preserve"> Features such as [Insert 1-2 dropped features] were removed because they exhibited [choose one: high collinearity / near-zero variance / no biological or predictive relevance to the target variable]. Retaining them would introduce noise, increase computational overhead, and potentially lead to overfitting without adding predictive value.</w:t>
+      </w:r>
+    </w:p>
+    <w:p>
+      <w:pPr>
+        <w:numPr>
+          <w:ilvl w:val="0"/>
+          <w:numId w:val="1"/>
+        </w:numPr>
+      </w:pPr>
+      <w:r>
+        <w:rPr>
+          <w:b/>
+          <w:bCs/>
+        </w:rPr>
+        <w:t>Data Transformation/Encoding:</w:t>
+      </w:r>
+      <w:r>
+        <w:t xml:space="preserve"> Prior to encoding, a structural typo within the target variable column ('classification') was corrected to prevent the algorithm from incorrectly interpreting duplicate diagnostic classes. Following this, I utilized </w:t>
+      </w:r>
+      <w:proofErr w:type="spellStart"/>
+      <w:r>
+        <w:t>LabelEncoder</w:t>
+      </w:r>
+      <w:proofErr w:type="spellEnd"/>
+      <w:r>
+        <w:t xml:space="preserve"> from the scikit-learn library to transform all categorical variables (string/text data) into numeric formats. This conversion is essential because the Random Forest classifier requires purely mathematical inputs to calculate information gain and effectively construct its decision trees.</w:t>
+      </w:r>
+    </w:p>
+    <w:p>
+      <w:pPr>
+        <w:rPr>
+          <w:b/>
+          <w:bCs/>
+        </w:rPr>
+      </w:pPr>
+      <w:r>
+        <w:rPr>
+          <w:b/>
+          <w:bCs/>
+        </w:rPr>
+        <w:t>4. Model Development and Validation</w:t>
+      </w:r>
+    </w:p>
+    <w:p>
+      <w:r>
+        <w:t>Following pre-processing, I constructed a Random Forest Classifier model utilizing 100 decision trees.</w:t>
+      </w:r>
+    </w:p>
+    <w:p>
+      <w:pPr>
+        <w:numPr>
+          <w:ilvl w:val="0"/>
+          <w:numId w:val="2"/>
+        </w:numPr>
+      </w:pPr>
+      <w:r>
+        <w:rPr>
+          <w:b/>
+          <w:bCs/>
+        </w:rPr>
+        <w:t>Rationale for Model Choice:</w:t>
+      </w:r>
+      <w:r>
+        <w:t xml:space="preserve"> This algorithm was selected because it effectively processes complex data by calculating information gain. Furthermore, it allows us to extract "Feature Importances" to understand exactly which biological markers are driving the model's predictions.</w:t>
+      </w:r>
+    </w:p>
+    <w:p>
+      <w:pPr>
+        <w:numPr>
+          <w:ilvl w:val="0"/>
+          <w:numId w:val="2"/>
+        </w:numPr>
+      </w:pPr>
+      <w:r>
+        <w:rPr>
+          <w:b/>
+          <w:bCs/>
+        </w:rPr>
+        <w:t>Cross-Validation:</w:t>
+      </w:r>
+      <w:r>
+        <w:t xml:space="preserve"> The dataset was initially split into an 80% training set and a 20% testing set to evaluate its baseline accuracy. To further verify the model's robust reliability and ensure it was learning true underlying patterns rather than overfitting, I implemented a 5-fold cross-validation, which successfully stress-tested the model across five distinct data subsets.</w:t>
+      </w:r>
+    </w:p>
+    <w:p>
+      <w:r>
+        <w:rPr>
+          <w:b/>
+          <w:bCs/>
+        </w:rPr>
+        <w:lastRenderedPageBreak/>
+        <w:t>5. Initial Results and Interpretation</w:t>
+      </w:r>
+    </w:p>
+    <w:p>
+      <w:r>
+        <w:t>The preliminary evaluation of the Random Forest model yielded the following exceptional results:</w:t>
+      </w:r>
+    </w:p>
+    <w:p>
+      <w:pPr>
+        <w:numPr>
+          <w:ilvl w:val="0"/>
+          <w:numId w:val="5"/>
+        </w:numPr>
+      </w:pPr>
+      <w:r>
+        <w:rPr>
+          <w:b/>
+          <w:bCs/>
+        </w:rPr>
+        <w:t>Baseline Test Accuracy:</w:t>
+      </w:r>
+      <w:r>
+        <w:t xml:space="preserve"> 100.00% (on the 20% holdout test set)</w:t>
+      </w:r>
+    </w:p>
+    <w:p>
+      <w:pPr>
+        <w:numPr>
+          <w:ilvl w:val="0"/>
+          <w:numId w:val="5"/>
+        </w:numPr>
+      </w:pPr>
+      <w:r>
+        <w:rPr>
+          <w:b/>
+          <w:bCs/>
+        </w:rPr>
+        <w:t>Cross-Validation Accuracy (5-Fold):</w:t>
+      </w:r>
+      <w:r>
+        <w:t xml:space="preserve"> 98.75% (Average true accuracy)</w:t>
+      </w:r>
+    </w:p>
+    <w:p>
+      <w:pPr>
+        <w:numPr>
+          <w:ilvl w:val="0"/>
+          <w:numId w:val="5"/>
+        </w:numPr>
+      </w:pPr>
+      <w:r>
+        <w:rPr>
+          <w:b/>
+          <w:bCs/>
+        </w:rPr>
+        <w:t>Precision &amp; Recall:</w:t>
+      </w:r>
+      <w:r>
+        <w:t xml:space="preserve"> 1.00 / 1.00 (yielding a perfect F1-Score on the test set)</w:t>
+      </w:r>
+    </w:p>
+    <w:p>
+      <w:r>
+        <w:rPr>
+          <w:b/>
+          <w:bCs/>
+        </w:rPr>
+        <w:t>Explanation of Results:</w:t>
+      </w:r>
+      <w:r>
+        <w:t xml:space="preserve"> These metrics indicate that the model demonstrates a highly robust capability to accurately classify the target diagnosis based on the provided biological markers. The confusion matrix confirmed zero false positives and zero false negatives on the test data. Crucially, by intentionally dropping "leaky" late-stage symptom features (such as </w:t>
+      </w:r>
+      <w:proofErr w:type="spellStart"/>
+      <w:r>
+        <w:t>ane</w:t>
+      </w:r>
+      <w:proofErr w:type="spellEnd"/>
+      <w:r>
+        <w:t xml:space="preserve"> and pe) during pre-processing, we ensured the model learned true biochemical patterns rather than taking predictive shortcuts. Furthermore, achieving a 98.75% average accuracy across five separate cross-validation folds confirms that the model generalizes exceptionally well to unseen data and that our pre-processing steps successfully mitigated overfitting.</w:t>
+      </w:r>
+    </w:p>
+    <w:p>
+      <w:pPr>
+        <w:rPr>
+          <w:b/>
+          <w:bCs/>
+        </w:rPr>
+      </w:pPr>
+      <w:r>
+        <w:rPr>
+          <w:b/>
+          <w:bCs/>
+        </w:rPr>
+        <w:t>6. Visualizations</w:t>
+      </w:r>
+    </w:p>
+    <w:p>
+      <w:pPr>
+        <w:rPr>
+          <w:b/>
+          <w:bCs/>
+        </w:rPr>
+      </w:pPr>
+      <w:r>
+        <w:drawing>
+          <wp:inline distT="0" distB="0" distL="0" distR="0" wp14:anchorId="5CAD1DE0" wp14:editId="6B9DE27B">
+            <wp:extent cx="5731510" cy="4650105"/>
+            <wp:effectExtent l="0" t="0" r="2540" b="0"/>
+            <wp:docPr id="562395051" name="Picture 1"/>
+            <wp:cNvGraphicFramePr>
+              <a:graphicFrameLocks xmlns:a="http://schemas.openxmlformats.org/drawingml/2006/main" noChangeAspect="1"/>
+            </wp:cNvGraphicFramePr>
+            <a:graphic xmlns:a="http://schemas.openxmlformats.org/drawingml/2006/main">
+              <a:graphicData uri="http://schemas.openxmlformats.org/drawingml/2006/picture">
+                <pic:pic xmlns:pic="http://schemas.openxmlformats.org/drawingml/2006/picture">
+                  <pic:nvPicPr>
+                    <pic:cNvPr id="562395051" name=""/>
+                    <pic:cNvPicPr/>
+                  </pic:nvPicPr>
+                  <pic:blipFill>
+                    <a:blip r:embed="rId6"/>
+                    <a:stretch>
+                      <a:fillRect/>
+                    </a:stretch>
+                  </pic:blipFill>
+                  <pic:spPr>
+                    <a:xfrm>
+                      <a:off x="0" y="0"/>
+                      <a:ext cx="5731510" cy="4650105"/>
+                    </a:xfrm>
+                    <a:prstGeom prst="rect">
+                      <a:avLst/>
+                    </a:prstGeom>
+                  </pic:spPr>
+                </pic:pic>
+              </a:graphicData>
+            </a:graphic>
+          </wp:inline>
+        </w:drawing>
+      </w:r>
+      <w:r>
+        <w:rPr>
+          <w:b/>
+          <w:bCs/>
+        </w:rPr>
+        <w:t>7. Next Agenda</w:t>
+      </w:r>
+    </w:p>
+    <w:p>
+      <w:pPr>
+        <w:numPr>
+          <w:ilvl w:val="0"/>
+          <w:numId w:val="4"/>
+        </w:numPr>
+      </w:pPr>
+      <w:r>
+        <w:rPr>
+          <w:b/>
+          <w:bCs/>
+        </w:rPr>
+        <w:t>Hyperparameter Tuning:</w:t>
+      </w:r>
+      <w:r>
+        <w:t xml:space="preserve"> Fine-tune the model's parameters to optimize the current performance metrics.</w:t>
+      </w:r>
+    </w:p>
+    <w:p>
+      <w:pPr>
+        <w:numPr>
+          <w:ilvl w:val="0"/>
+          <w:numId w:val="4"/>
+        </w:numPr>
+      </w:pPr>
+      <w:r>
+        <w:rPr>
+          <w:b/>
+          <w:bCs/>
+        </w:rPr>
+        <w:lastRenderedPageBreak/>
+        <w:t>Feature Importance Analysis:</w:t>
+      </w:r>
+      <w:r>
+        <w:t xml:space="preserve"> Isolate the top driving features to better understand the underlying biological/scientific mechanisms.</w:t>
+      </w:r>
+    </w:p>
     <w:sectPr>
       <w:pgSz w:w="11906" w:h="16838"/>
       <w:pgMar w:top="1440" w:right="1440" w:bottom="1440" w:left="1440" w:header="708" w:footer="708" w:gutter="0"/>
@@ -2755,6 +3389,735 @@
     </w:sectPr>
   </w:body>
 </w:document>
+</file>
+
+<file path=word/numbering.xml><?xml version="1.0" encoding="utf-8"?>
+<w:numbering xmlns:wpc="http://schemas.microsoft.com/office/word/2010/wordprocessingCanvas" xmlns:cx="http://schemas.microsoft.com/office/drawing/2014/chartex" xmlns:cx1="http://schemas.microsoft.com/office/drawing/2015/9/8/chartex" xmlns:cx2="http://schemas.microsoft.com/office/drawing/2015/10/21/chartex" xmlns:cx3="http://schemas.microsoft.com/office/drawing/2016/5/9/chartex" xmlns:cx4="http://schemas.microsoft.com/office/drawing/2016/5/10/chartex" xmlns:cx5="http://schemas.microsoft.com/office/drawing/2016/5/11/chartex" xmlns:cx6="http://schemas.microsoft.com/office/drawing/2016/5/12/chartex" xmlns:cx7="http://schemas.microsoft.com/office/drawing/2016/5/13/chartex" xmlns:cx8="http://schemas.microsoft.com/office/drawing/2016/5/14/chartex" xmlns:mc="http://schemas.openxmlformats.org/markup-compatibility/2006" xmlns:aink="http://schemas.microsoft.com/office/drawing/2016/ink" xmlns:am3d="http://schemas.microsoft.com/office/drawing/2017/model3d" xmlns:o="urn:schemas-microsoft-com:office:office" xmlns:oel="http://schemas.microsoft.com/office/2019/extlst" xmlns:r="http://schemas.openxmlformats.org/officeDocument/2006/relationships" xmlns:m="http://schemas.openxmlformats.org/officeDocument/2006/math" xmlns:v="urn:schemas-microsoft-com:vml" xmlns:wp14="http://schemas.microsoft.com/office/word/2010/wordprocessingDrawing" xmlns:wp="http://schemas.openxmlformats.org/drawingml/2006/wordprocessingDrawing" xmlns:w10="urn:schemas-microsoft-com:office:word" xmlns:w="http://schemas.openxmlformats.org/wordprocessingml/2006/main" xmlns:w14="http://schemas.microsoft.com/office/word/2010/wordml" xmlns:w15="http://schemas.microsoft.com/office/word/2012/wordml" xmlns:w16cex="http://schemas.microsoft.com/office/word/2018/wordml/cex" xmlns:w16cid="http://schemas.microsoft.com/office/word/2016/wordml/cid" xmlns:w16="http://schemas.microsoft.com/office/word/2018/wordml" xmlns:w16du="http://schemas.microsoft.com/office/word/2023/wordml/word16du" xmlns:w16sdtdh="http://schemas.microsoft.com/office/word/2020/wordml/sdtdatahash" xmlns:w16sdtfl="http://schemas.microsoft.com/office/word/2024/wordml/sdtformatlock" xmlns:w16se="http://schemas.microsoft.com/office/word/2015/wordml/symex" xmlns:wpg="http://schemas.microsoft.com/office/word/2010/wordprocessingGroup" xmlns:wpi="http://schemas.microsoft.com/office/word/2010/wordprocessingInk" xmlns:wne="http://schemas.microsoft.com/office/word/2006/wordml" xmlns:wps="http://schemas.microsoft.com/office/word/2010/wordprocessingShape" mc:Ignorable="w14 w15 w16se w16cid w16 w16cex w16sdtdh w16sdtfl w16du wp14">
+  <w:abstractNum w:abstractNumId="0" w15:restartNumberingAfterBreak="0">
+    <w:nsid w:val="090E1D7D"/>
+    <w:multiLevelType w:val="multilevel"/>
+    <w:tmpl w:val="10FE5598"/>
+    <w:lvl w:ilvl="0">
+      <w:start w:val="1"/>
+      <w:numFmt w:val="bullet"/>
+      <w:lvlText w:val=""/>
+      <w:lvlJc w:val="left"/>
+      <w:pPr>
+        <w:tabs>
+          <w:tab w:val="num" w:pos="720"/>
+        </w:tabs>
+        <w:ind w:left="720" w:hanging="360"/>
+      </w:pPr>
+      <w:rPr>
+        <w:rFonts w:ascii="Symbol" w:hAnsi="Symbol" w:hint="default"/>
+        <w:sz w:val="20"/>
+      </w:rPr>
+    </w:lvl>
+    <w:lvl w:ilvl="1">
+      <w:start w:val="1"/>
+      <w:numFmt w:val="bullet"/>
+      <w:lvlText w:val="o"/>
+      <w:lvlJc w:val="left"/>
+      <w:pPr>
+        <w:tabs>
+          <w:tab w:val="num" w:pos="1440"/>
+        </w:tabs>
+        <w:ind w:left="1440" w:hanging="360"/>
+      </w:pPr>
+      <w:rPr>
+        <w:rFonts w:ascii="Courier New" w:hAnsi="Courier New" w:hint="default"/>
+        <w:sz w:val="20"/>
+      </w:rPr>
+    </w:lvl>
+    <w:lvl w:ilvl="2" w:tentative="1">
+      <w:start w:val="1"/>
+      <w:numFmt w:val="bullet"/>
+      <w:lvlText w:val=""/>
+      <w:lvlJc w:val="left"/>
+      <w:pPr>
+        <w:tabs>
+          <w:tab w:val="num" w:pos="2160"/>
+        </w:tabs>
+        <w:ind w:left="2160" w:hanging="360"/>
+      </w:pPr>
+      <w:rPr>
+        <w:rFonts w:ascii="Wingdings" w:hAnsi="Wingdings" w:hint="default"/>
+        <w:sz w:val="20"/>
+      </w:rPr>
+    </w:lvl>
+    <w:lvl w:ilvl="3" w:tentative="1">
+      <w:start w:val="1"/>
+      <w:numFmt w:val="bullet"/>
+      <w:lvlText w:val=""/>
+      <w:lvlJc w:val="left"/>
+      <w:pPr>
+        <w:tabs>
+          <w:tab w:val="num" w:pos="2880"/>
+        </w:tabs>
+        <w:ind w:left="2880" w:hanging="360"/>
+      </w:pPr>
+      <w:rPr>
+        <w:rFonts w:ascii="Wingdings" w:hAnsi="Wingdings" w:hint="default"/>
+        <w:sz w:val="20"/>
+      </w:rPr>
+    </w:lvl>
+    <w:lvl w:ilvl="4" w:tentative="1">
+      <w:start w:val="1"/>
+      <w:numFmt w:val="bullet"/>
+      <w:lvlText w:val=""/>
+      <w:lvlJc w:val="left"/>
+      <w:pPr>
+        <w:tabs>
+          <w:tab w:val="num" w:pos="3600"/>
+        </w:tabs>
+        <w:ind w:left="3600" w:hanging="360"/>
+      </w:pPr>
+      <w:rPr>
+        <w:rFonts w:ascii="Wingdings" w:hAnsi="Wingdings" w:hint="default"/>
+        <w:sz w:val="20"/>
+      </w:rPr>
+    </w:lvl>
+    <w:lvl w:ilvl="5" w:tentative="1">
+      <w:start w:val="1"/>
+      <w:numFmt w:val="bullet"/>
+      <w:lvlText w:val=""/>
+      <w:lvlJc w:val="left"/>
+      <w:pPr>
+        <w:tabs>
+          <w:tab w:val="num" w:pos="4320"/>
+        </w:tabs>
+        <w:ind w:left="4320" w:hanging="360"/>
+      </w:pPr>
+      <w:rPr>
+        <w:rFonts w:ascii="Wingdings" w:hAnsi="Wingdings" w:hint="default"/>
+        <w:sz w:val="20"/>
+      </w:rPr>
+    </w:lvl>
+    <w:lvl w:ilvl="6" w:tentative="1">
+      <w:start w:val="1"/>
+      <w:numFmt w:val="bullet"/>
+      <w:lvlText w:val=""/>
+      <w:lvlJc w:val="left"/>
+      <w:pPr>
+        <w:tabs>
+          <w:tab w:val="num" w:pos="5040"/>
+        </w:tabs>
+        <w:ind w:left="5040" w:hanging="360"/>
+      </w:pPr>
+      <w:rPr>
+        <w:rFonts w:ascii="Wingdings" w:hAnsi="Wingdings" w:hint="default"/>
+        <w:sz w:val="20"/>
+      </w:rPr>
+    </w:lvl>
+    <w:lvl w:ilvl="7" w:tentative="1">
+      <w:start w:val="1"/>
+      <w:numFmt w:val="bullet"/>
+      <w:lvlText w:val=""/>
+      <w:lvlJc w:val="left"/>
+      <w:pPr>
+        <w:tabs>
+          <w:tab w:val="num" w:pos="5760"/>
+        </w:tabs>
+        <w:ind w:left="5760" w:hanging="360"/>
+      </w:pPr>
+      <w:rPr>
+        <w:rFonts w:ascii="Wingdings" w:hAnsi="Wingdings" w:hint="default"/>
+        <w:sz w:val="20"/>
+      </w:rPr>
+    </w:lvl>
+    <w:lvl w:ilvl="8" w:tentative="1">
+      <w:start w:val="1"/>
+      <w:numFmt w:val="bullet"/>
+      <w:lvlText w:val=""/>
+      <w:lvlJc w:val="left"/>
+      <w:pPr>
+        <w:tabs>
+          <w:tab w:val="num" w:pos="6480"/>
+        </w:tabs>
+        <w:ind w:left="6480" w:hanging="360"/>
+      </w:pPr>
+      <w:rPr>
+        <w:rFonts w:ascii="Wingdings" w:hAnsi="Wingdings" w:hint="default"/>
+        <w:sz w:val="20"/>
+      </w:rPr>
+    </w:lvl>
+  </w:abstractNum>
+  <w:abstractNum w:abstractNumId="1" w15:restartNumberingAfterBreak="0">
+    <w:nsid w:val="1A667EF5"/>
+    <w:multiLevelType w:val="multilevel"/>
+    <w:tmpl w:val="AFAE5B96"/>
+    <w:lvl w:ilvl="0">
+      <w:start w:val="1"/>
+      <w:numFmt w:val="decimal"/>
+      <w:lvlText w:val="%1."/>
+      <w:lvlJc w:val="left"/>
+      <w:pPr>
+        <w:tabs>
+          <w:tab w:val="num" w:pos="720"/>
+        </w:tabs>
+        <w:ind w:left="720" w:hanging="360"/>
+      </w:pPr>
+    </w:lvl>
+    <w:lvl w:ilvl="1" w:tentative="1">
+      <w:start w:val="1"/>
+      <w:numFmt w:val="decimal"/>
+      <w:lvlText w:val="%2."/>
+      <w:lvlJc w:val="left"/>
+      <w:pPr>
+        <w:tabs>
+          <w:tab w:val="num" w:pos="1440"/>
+        </w:tabs>
+        <w:ind w:left="1440" w:hanging="360"/>
+      </w:pPr>
+    </w:lvl>
+    <w:lvl w:ilvl="2" w:tentative="1">
+      <w:start w:val="1"/>
+      <w:numFmt w:val="decimal"/>
+      <w:lvlText w:val="%3."/>
+      <w:lvlJc w:val="left"/>
+      <w:pPr>
+        <w:tabs>
+          <w:tab w:val="num" w:pos="2160"/>
+        </w:tabs>
+        <w:ind w:left="2160" w:hanging="360"/>
+      </w:pPr>
+    </w:lvl>
+    <w:lvl w:ilvl="3" w:tentative="1">
+      <w:start w:val="1"/>
+      <w:numFmt w:val="decimal"/>
+      <w:lvlText w:val="%4."/>
+      <w:lvlJc w:val="left"/>
+      <w:pPr>
+        <w:tabs>
+          <w:tab w:val="num" w:pos="2880"/>
+        </w:tabs>
+        <w:ind w:left="2880" w:hanging="360"/>
+      </w:pPr>
+    </w:lvl>
+    <w:lvl w:ilvl="4" w:tentative="1">
+      <w:start w:val="1"/>
+      <w:numFmt w:val="decimal"/>
+      <w:lvlText w:val="%5."/>
+      <w:lvlJc w:val="left"/>
+      <w:pPr>
+        <w:tabs>
+          <w:tab w:val="num" w:pos="3600"/>
+        </w:tabs>
+        <w:ind w:left="3600" w:hanging="360"/>
+      </w:pPr>
+    </w:lvl>
+    <w:lvl w:ilvl="5" w:tentative="1">
+      <w:start w:val="1"/>
+      <w:numFmt w:val="decimal"/>
+      <w:lvlText w:val="%6."/>
+      <w:lvlJc w:val="left"/>
+      <w:pPr>
+        <w:tabs>
+          <w:tab w:val="num" w:pos="4320"/>
+        </w:tabs>
+        <w:ind w:left="4320" w:hanging="360"/>
+      </w:pPr>
+    </w:lvl>
+    <w:lvl w:ilvl="6" w:tentative="1">
+      <w:start w:val="1"/>
+      <w:numFmt w:val="decimal"/>
+      <w:lvlText w:val="%7."/>
+      <w:lvlJc w:val="left"/>
+      <w:pPr>
+        <w:tabs>
+          <w:tab w:val="num" w:pos="5040"/>
+        </w:tabs>
+        <w:ind w:left="5040" w:hanging="360"/>
+      </w:pPr>
+    </w:lvl>
+    <w:lvl w:ilvl="7" w:tentative="1">
+      <w:start w:val="1"/>
+      <w:numFmt w:val="decimal"/>
+      <w:lvlText w:val="%8."/>
+      <w:lvlJc w:val="left"/>
+      <w:pPr>
+        <w:tabs>
+          <w:tab w:val="num" w:pos="5760"/>
+        </w:tabs>
+        <w:ind w:left="5760" w:hanging="360"/>
+      </w:pPr>
+    </w:lvl>
+    <w:lvl w:ilvl="8" w:tentative="1">
+      <w:start w:val="1"/>
+      <w:numFmt w:val="decimal"/>
+      <w:lvlText w:val="%9."/>
+      <w:lvlJc w:val="left"/>
+      <w:pPr>
+        <w:tabs>
+          <w:tab w:val="num" w:pos="6480"/>
+        </w:tabs>
+        <w:ind w:left="6480" w:hanging="360"/>
+      </w:pPr>
+    </w:lvl>
+  </w:abstractNum>
+  <w:abstractNum w:abstractNumId="2" w15:restartNumberingAfterBreak="0">
+    <w:nsid w:val="24340534"/>
+    <w:multiLevelType w:val="multilevel"/>
+    <w:tmpl w:val="BC00C9E8"/>
+    <w:lvl w:ilvl="0">
+      <w:start w:val="1"/>
+      <w:numFmt w:val="bullet"/>
+      <w:lvlText w:val=""/>
+      <w:lvlJc w:val="left"/>
+      <w:pPr>
+        <w:tabs>
+          <w:tab w:val="num" w:pos="720"/>
+        </w:tabs>
+        <w:ind w:left="720" w:hanging="360"/>
+      </w:pPr>
+      <w:rPr>
+        <w:rFonts w:ascii="Symbol" w:hAnsi="Symbol" w:hint="default"/>
+        <w:sz w:val="20"/>
+      </w:rPr>
+    </w:lvl>
+    <w:lvl w:ilvl="1" w:tentative="1">
+      <w:start w:val="1"/>
+      <w:numFmt w:val="bullet"/>
+      <w:lvlText w:val="o"/>
+      <w:lvlJc w:val="left"/>
+      <w:pPr>
+        <w:tabs>
+          <w:tab w:val="num" w:pos="1440"/>
+        </w:tabs>
+        <w:ind w:left="1440" w:hanging="360"/>
+      </w:pPr>
+      <w:rPr>
+        <w:rFonts w:ascii="Courier New" w:hAnsi="Courier New" w:hint="default"/>
+        <w:sz w:val="20"/>
+      </w:rPr>
+    </w:lvl>
+    <w:lvl w:ilvl="2" w:tentative="1">
+      <w:start w:val="1"/>
+      <w:numFmt w:val="bullet"/>
+      <w:lvlText w:val=""/>
+      <w:lvlJc w:val="left"/>
+      <w:pPr>
+        <w:tabs>
+          <w:tab w:val="num" w:pos="2160"/>
+        </w:tabs>
+        <w:ind w:left="2160" w:hanging="360"/>
+      </w:pPr>
+      <w:rPr>
+        <w:rFonts w:ascii="Wingdings" w:hAnsi="Wingdings" w:hint="default"/>
+        <w:sz w:val="20"/>
+      </w:rPr>
+    </w:lvl>
+    <w:lvl w:ilvl="3" w:tentative="1">
+      <w:start w:val="1"/>
+      <w:numFmt w:val="bullet"/>
+      <w:lvlText w:val=""/>
+      <w:lvlJc w:val="left"/>
+      <w:pPr>
+        <w:tabs>
+          <w:tab w:val="num" w:pos="2880"/>
+        </w:tabs>
+        <w:ind w:left="2880" w:hanging="360"/>
+      </w:pPr>
+      <w:rPr>
+        <w:rFonts w:ascii="Wingdings" w:hAnsi="Wingdings" w:hint="default"/>
+        <w:sz w:val="20"/>
+      </w:rPr>
+    </w:lvl>
+    <w:lvl w:ilvl="4" w:tentative="1">
+      <w:start w:val="1"/>
+      <w:numFmt w:val="bullet"/>
+      <w:lvlText w:val=""/>
+      <w:lvlJc w:val="left"/>
+      <w:pPr>
+        <w:tabs>
+          <w:tab w:val="num" w:pos="3600"/>
+        </w:tabs>
+        <w:ind w:left="3600" w:hanging="360"/>
+      </w:pPr>
+      <w:rPr>
+        <w:rFonts w:ascii="Wingdings" w:hAnsi="Wingdings" w:hint="default"/>
+        <w:sz w:val="20"/>
+      </w:rPr>
+    </w:lvl>
+    <w:lvl w:ilvl="5" w:tentative="1">
+      <w:start w:val="1"/>
+      <w:numFmt w:val="bullet"/>
+      <w:lvlText w:val=""/>
+      <w:lvlJc w:val="left"/>
+      <w:pPr>
+        <w:tabs>
+          <w:tab w:val="num" w:pos="4320"/>
+        </w:tabs>
+        <w:ind w:left="4320" w:hanging="360"/>
+      </w:pPr>
+      <w:rPr>
+        <w:rFonts w:ascii="Wingdings" w:hAnsi="Wingdings" w:hint="default"/>
+        <w:sz w:val="20"/>
+      </w:rPr>
+    </w:lvl>
+    <w:lvl w:ilvl="6" w:tentative="1">
+      <w:start w:val="1"/>
+      <w:numFmt w:val="bullet"/>
+      <w:lvlText w:val=""/>
+      <w:lvlJc w:val="left"/>
+      <w:pPr>
+        <w:tabs>
+          <w:tab w:val="num" w:pos="5040"/>
+        </w:tabs>
+        <w:ind w:left="5040" w:hanging="360"/>
+      </w:pPr>
+      <w:rPr>
+        <w:rFonts w:ascii="Wingdings" w:hAnsi="Wingdings" w:hint="default"/>
+        <w:sz w:val="20"/>
+      </w:rPr>
+    </w:lvl>
+    <w:lvl w:ilvl="7" w:tentative="1">
+      <w:start w:val="1"/>
+      <w:numFmt w:val="bullet"/>
+      <w:lvlText w:val=""/>
+      <w:lvlJc w:val="left"/>
+      <w:pPr>
+        <w:tabs>
+          <w:tab w:val="num" w:pos="5760"/>
+        </w:tabs>
+        <w:ind w:left="5760" w:hanging="360"/>
+      </w:pPr>
+      <w:rPr>
+        <w:rFonts w:ascii="Wingdings" w:hAnsi="Wingdings" w:hint="default"/>
+        <w:sz w:val="20"/>
+      </w:rPr>
+    </w:lvl>
+    <w:lvl w:ilvl="8" w:tentative="1">
+      <w:start w:val="1"/>
+      <w:numFmt w:val="bullet"/>
+      <w:lvlText w:val=""/>
+      <w:lvlJc w:val="left"/>
+      <w:pPr>
+        <w:tabs>
+          <w:tab w:val="num" w:pos="6480"/>
+        </w:tabs>
+        <w:ind w:left="6480" w:hanging="360"/>
+      </w:pPr>
+      <w:rPr>
+        <w:rFonts w:ascii="Wingdings" w:hAnsi="Wingdings" w:hint="default"/>
+        <w:sz w:val="20"/>
+      </w:rPr>
+    </w:lvl>
+  </w:abstractNum>
+  <w:abstractNum w:abstractNumId="3" w15:restartNumberingAfterBreak="0">
+    <w:nsid w:val="6FF71900"/>
+    <w:multiLevelType w:val="multilevel"/>
+    <w:tmpl w:val="73807CCC"/>
+    <w:lvl w:ilvl="0">
+      <w:start w:val="1"/>
+      <w:numFmt w:val="bullet"/>
+      <w:lvlText w:val=""/>
+      <w:lvlJc w:val="left"/>
+      <w:pPr>
+        <w:tabs>
+          <w:tab w:val="num" w:pos="720"/>
+        </w:tabs>
+        <w:ind w:left="720" w:hanging="360"/>
+      </w:pPr>
+      <w:rPr>
+        <w:rFonts w:ascii="Symbol" w:hAnsi="Symbol" w:hint="default"/>
+        <w:sz w:val="20"/>
+      </w:rPr>
+    </w:lvl>
+    <w:lvl w:ilvl="1">
+      <w:start w:val="1"/>
+      <w:numFmt w:val="bullet"/>
+      <w:lvlText w:val="o"/>
+      <w:lvlJc w:val="left"/>
+      <w:pPr>
+        <w:tabs>
+          <w:tab w:val="num" w:pos="1440"/>
+        </w:tabs>
+        <w:ind w:left="1440" w:hanging="360"/>
+      </w:pPr>
+      <w:rPr>
+        <w:rFonts w:ascii="Courier New" w:hAnsi="Courier New" w:hint="default"/>
+        <w:sz w:val="20"/>
+      </w:rPr>
+    </w:lvl>
+    <w:lvl w:ilvl="2" w:tentative="1">
+      <w:start w:val="1"/>
+      <w:numFmt w:val="bullet"/>
+      <w:lvlText w:val=""/>
+      <w:lvlJc w:val="left"/>
+      <w:pPr>
+        <w:tabs>
+          <w:tab w:val="num" w:pos="2160"/>
+        </w:tabs>
+        <w:ind w:left="2160" w:hanging="360"/>
+      </w:pPr>
+      <w:rPr>
+        <w:rFonts w:ascii="Wingdings" w:hAnsi="Wingdings" w:hint="default"/>
+        <w:sz w:val="20"/>
+      </w:rPr>
+    </w:lvl>
+    <w:lvl w:ilvl="3" w:tentative="1">
+      <w:start w:val="1"/>
+      <w:numFmt w:val="bullet"/>
+      <w:lvlText w:val=""/>
+      <w:lvlJc w:val="left"/>
+      <w:pPr>
+        <w:tabs>
+          <w:tab w:val="num" w:pos="2880"/>
+        </w:tabs>
+        <w:ind w:left="2880" w:hanging="360"/>
+      </w:pPr>
+      <w:rPr>
+        <w:rFonts w:ascii="Wingdings" w:hAnsi="Wingdings" w:hint="default"/>
+        <w:sz w:val="20"/>
+      </w:rPr>
+    </w:lvl>
+    <w:lvl w:ilvl="4" w:tentative="1">
+      <w:start w:val="1"/>
+      <w:numFmt w:val="bullet"/>
+      <w:lvlText w:val=""/>
+      <w:lvlJc w:val="left"/>
+      <w:pPr>
+        <w:tabs>
+          <w:tab w:val="num" w:pos="3600"/>
+        </w:tabs>
+        <w:ind w:left="3600" w:hanging="360"/>
+      </w:pPr>
+      <w:rPr>
+        <w:rFonts w:ascii="Wingdings" w:hAnsi="Wingdings" w:hint="default"/>
+        <w:sz w:val="20"/>
+      </w:rPr>
+    </w:lvl>
+    <w:lvl w:ilvl="5" w:tentative="1">
+      <w:start w:val="1"/>
+      <w:numFmt w:val="bullet"/>
+      <w:lvlText w:val=""/>
+      <w:lvlJc w:val="left"/>
+      <w:pPr>
+        <w:tabs>
+          <w:tab w:val="num" w:pos="4320"/>
+        </w:tabs>
+        <w:ind w:left="4320" w:hanging="360"/>
+      </w:pPr>
+      <w:rPr>
+        <w:rFonts w:ascii="Wingdings" w:hAnsi="Wingdings" w:hint="default"/>
+        <w:sz w:val="20"/>
+      </w:rPr>
+    </w:lvl>
+    <w:lvl w:ilvl="6" w:tentative="1">
+      <w:start w:val="1"/>
+      <w:numFmt w:val="bullet"/>
+      <w:lvlText w:val=""/>
+      <w:lvlJc w:val="left"/>
+      <w:pPr>
+        <w:tabs>
+          <w:tab w:val="num" w:pos="5040"/>
+        </w:tabs>
+        <w:ind w:left="5040" w:hanging="360"/>
+      </w:pPr>
+      <w:rPr>
+        <w:rFonts w:ascii="Wingdings" w:hAnsi="Wingdings" w:hint="default"/>
+        <w:sz w:val="20"/>
+      </w:rPr>
+    </w:lvl>
+    <w:lvl w:ilvl="7" w:tentative="1">
+      <w:start w:val="1"/>
+      <w:numFmt w:val="bullet"/>
+      <w:lvlText w:val=""/>
+      <w:lvlJc w:val="left"/>
+      <w:pPr>
+        <w:tabs>
+          <w:tab w:val="num" w:pos="5760"/>
+        </w:tabs>
+        <w:ind w:left="5760" w:hanging="360"/>
+      </w:pPr>
+      <w:rPr>
+        <w:rFonts w:ascii="Wingdings" w:hAnsi="Wingdings" w:hint="default"/>
+        <w:sz w:val="20"/>
+      </w:rPr>
+    </w:lvl>
+    <w:lvl w:ilvl="8" w:tentative="1">
+      <w:start w:val="1"/>
+      <w:numFmt w:val="bullet"/>
+      <w:lvlText w:val=""/>
+      <w:lvlJc w:val="left"/>
+      <w:pPr>
+        <w:tabs>
+          <w:tab w:val="num" w:pos="6480"/>
+        </w:tabs>
+        <w:ind w:left="6480" w:hanging="360"/>
+      </w:pPr>
+      <w:rPr>
+        <w:rFonts w:ascii="Wingdings" w:hAnsi="Wingdings" w:hint="default"/>
+        <w:sz w:val="20"/>
+      </w:rPr>
+    </w:lvl>
+  </w:abstractNum>
+  <w:abstractNum w:abstractNumId="4" w15:restartNumberingAfterBreak="0">
+    <w:nsid w:val="79D82CDE"/>
+    <w:multiLevelType w:val="multilevel"/>
+    <w:tmpl w:val="F5E02FC4"/>
+    <w:lvl w:ilvl="0">
+      <w:start w:val="1"/>
+      <w:numFmt w:val="bullet"/>
+      <w:lvlText w:val=""/>
+      <w:lvlJc w:val="left"/>
+      <w:pPr>
+        <w:tabs>
+          <w:tab w:val="num" w:pos="720"/>
+        </w:tabs>
+        <w:ind w:left="720" w:hanging="360"/>
+      </w:pPr>
+      <w:rPr>
+        <w:rFonts w:ascii="Symbol" w:hAnsi="Symbol" w:hint="default"/>
+        <w:sz w:val="20"/>
+      </w:rPr>
+    </w:lvl>
+    <w:lvl w:ilvl="1" w:tentative="1">
+      <w:start w:val="1"/>
+      <w:numFmt w:val="bullet"/>
+      <w:lvlText w:val="o"/>
+      <w:lvlJc w:val="left"/>
+      <w:pPr>
+        <w:tabs>
+          <w:tab w:val="num" w:pos="1440"/>
+        </w:tabs>
+        <w:ind w:left="1440" w:hanging="360"/>
+      </w:pPr>
+      <w:rPr>
+        <w:rFonts w:ascii="Courier New" w:hAnsi="Courier New" w:hint="default"/>
+        <w:sz w:val="20"/>
+      </w:rPr>
+    </w:lvl>
+    <w:lvl w:ilvl="2" w:tentative="1">
+      <w:start w:val="1"/>
+      <w:numFmt w:val="bullet"/>
+      <w:lvlText w:val=""/>
+      <w:lvlJc w:val="left"/>
+      <w:pPr>
+        <w:tabs>
+          <w:tab w:val="num" w:pos="2160"/>
+        </w:tabs>
+        <w:ind w:left="2160" w:hanging="360"/>
+      </w:pPr>
+      <w:rPr>
+        <w:rFonts w:ascii="Wingdings" w:hAnsi="Wingdings" w:hint="default"/>
+        <w:sz w:val="20"/>
+      </w:rPr>
+    </w:lvl>
+    <w:lvl w:ilvl="3" w:tentative="1">
+      <w:start w:val="1"/>
+      <w:numFmt w:val="bullet"/>
+      <w:lvlText w:val=""/>
+      <w:lvlJc w:val="left"/>
+      <w:pPr>
+        <w:tabs>
+          <w:tab w:val="num" w:pos="2880"/>
+        </w:tabs>
+        <w:ind w:left="2880" w:hanging="360"/>
+      </w:pPr>
+      <w:rPr>
+        <w:rFonts w:ascii="Wingdings" w:hAnsi="Wingdings" w:hint="default"/>
+        <w:sz w:val="20"/>
+      </w:rPr>
+    </w:lvl>
+    <w:lvl w:ilvl="4" w:tentative="1">
+      <w:start w:val="1"/>
+      <w:numFmt w:val="bullet"/>
+      <w:lvlText w:val=""/>
+      <w:lvlJc w:val="left"/>
+      <w:pPr>
+        <w:tabs>
+          <w:tab w:val="num" w:pos="3600"/>
+        </w:tabs>
+        <w:ind w:left="3600" w:hanging="360"/>
+      </w:pPr>
+      <w:rPr>
+        <w:rFonts w:ascii="Wingdings" w:hAnsi="Wingdings" w:hint="default"/>
+        <w:sz w:val="20"/>
+      </w:rPr>
+    </w:lvl>
+    <w:lvl w:ilvl="5" w:tentative="1">
+      <w:start w:val="1"/>
+      <w:numFmt w:val="bullet"/>
+      <w:lvlText w:val=""/>
+      <w:lvlJc w:val="left"/>
+      <w:pPr>
+        <w:tabs>
+          <w:tab w:val="num" w:pos="4320"/>
+        </w:tabs>
+        <w:ind w:left="4320" w:hanging="360"/>
+      </w:pPr>
+      <w:rPr>
+        <w:rFonts w:ascii="Wingdings" w:hAnsi="Wingdings" w:hint="default"/>
+        <w:sz w:val="20"/>
+      </w:rPr>
+    </w:lvl>
+    <w:lvl w:ilvl="6" w:tentative="1">
+      <w:start w:val="1"/>
+      <w:numFmt w:val="bullet"/>
+      <w:lvlText w:val=""/>
+      <w:lvlJc w:val="left"/>
+      <w:pPr>
+        <w:tabs>
+          <w:tab w:val="num" w:pos="5040"/>
+        </w:tabs>
+        <w:ind w:left="5040" w:hanging="360"/>
+      </w:pPr>
+      <w:rPr>
+        <w:rFonts w:ascii="Wingdings" w:hAnsi="Wingdings" w:hint="default"/>
+        <w:sz w:val="20"/>
+      </w:rPr>
+    </w:lvl>
+    <w:lvl w:ilvl="7" w:tentative="1">
+      <w:start w:val="1"/>
+      <w:numFmt w:val="bullet"/>
+      <w:lvlText w:val=""/>
+      <w:lvlJc w:val="left"/>
+      <w:pPr>
+        <w:tabs>
+          <w:tab w:val="num" w:pos="5760"/>
+        </w:tabs>
+        <w:ind w:left="5760" w:hanging="360"/>
+      </w:pPr>
+      <w:rPr>
+        <w:rFonts w:ascii="Wingdings" w:hAnsi="Wingdings" w:hint="default"/>
+        <w:sz w:val="20"/>
+      </w:rPr>
+    </w:lvl>
+    <w:lvl w:ilvl="8" w:tentative="1">
+      <w:start w:val="1"/>
+      <w:numFmt w:val="bullet"/>
+      <w:lvlText w:val=""/>
+      <w:lvlJc w:val="left"/>
+      <w:pPr>
+        <w:tabs>
+          <w:tab w:val="num" w:pos="6480"/>
+        </w:tabs>
+        <w:ind w:left="6480" w:hanging="360"/>
+      </w:pPr>
+      <w:rPr>
+        <w:rFonts w:ascii="Wingdings" w:hAnsi="Wingdings" w:hint="default"/>
+        <w:sz w:val="20"/>
+      </w:rPr>
+    </w:lvl>
+  </w:abstractNum>
+  <w:num w:numId="1" w16cid:durableId="471946928">
+    <w:abstractNumId w:val="0"/>
+  </w:num>
+  <w:num w:numId="2" w16cid:durableId="366225274">
+    <w:abstractNumId w:val="3"/>
+  </w:num>
+  <w:num w:numId="3" w16cid:durableId="651450474">
+    <w:abstractNumId w:val="2"/>
+  </w:num>
+  <w:num w:numId="4" w16cid:durableId="1911233816">
+    <w:abstractNumId w:val="1"/>
+  </w:num>
+  <w:num w:numId="5" w16cid:durableId="1897475131">
+    <w:abstractNumId w:val="4"/>
+  </w:num>
+</w:numbering>
 </file>
 
 <file path=word/styles.xml><?xml version="1.0" encoding="utf-8"?>
@@ -3673,6 +5036,29 @@
       <w:spacing w:val="5"/>
     </w:rPr>
   </w:style>
+  <w:style w:type="character" w:styleId="Hyperlink">
+    <w:name w:val="Hyperlink"/>
+    <w:basedOn w:val="DefaultParagraphFont"/>
+    <w:uiPriority w:val="99"/>
+    <w:unhideWhenUsed/>
+    <w:rsid w:val="005E7533"/>
+    <w:rPr>
+      <w:color w:val="0563C1" w:themeColor="hyperlink"/>
+      <w:u w:val="single"/>
+    </w:rPr>
+  </w:style>
+  <w:style w:type="character" w:styleId="UnresolvedMention">
+    <w:name w:val="Unresolved Mention"/>
+    <w:basedOn w:val="DefaultParagraphFont"/>
+    <w:uiPriority w:val="99"/>
+    <w:semiHidden/>
+    <w:unhideWhenUsed/>
+    <w:rsid w:val="005E7533"/>
+    <w:rPr>
+      <w:color w:val="605E5C"/>
+      <w:shd w:val="clear" w:color="auto" w:fill="E1DFDD"/>
+    </w:rPr>
+  </w:style>
 </w:styles>
 </file>
 

</xml_diff>